<commit_message>
Update SQL extraction metrics and document changes
</commit_message>
<xml_diff>
--- a/Customer _Churn_Project_Change_Summary.docx
+++ b/Customer _Churn_Project_Change_Summary.docx
@@ -1015,6 +1015,95 @@
       </w:pPr>
       <w:r>
         <w:t>The conclusion notebook now displays the saved model comparison, calibration, probability-separation, confusion-matrix, ROC, precision-recall, and feature-importance charts at the end of the notebook.</w:t>
+      </w:r>
+    </w:p>
+    <w:p>
+      <w:pPr>
+        <w:pStyle w:val="Heading1"/>
+        <w:keepNext/>
+      </w:pPr>
+      <w:r>
+        <w:t>Cambios en la consulta SQL de extracción - 05/10/2026</w:t>
+      </w:r>
+    </w:p>
+    <w:p>
+      <w:pPr>
+        <w:pStyle w:val="ListNumber"/>
+        <w:keepLines/>
+      </w:pPr>
+      <w:r>
+        <w:rPr>
+          <w:b/>
+        </w:rPr>
+        <w:t xml:space="preserve">CTE Fechas y fechas de corte: </w:t>
+      </w:r>
+      <w:r>
+        <w:t>Se retiró el cálculo de FechaHoyOriginal y el desplazamiento de fechas basado en la diferencia entre GETDATE() y la última OrderDate. FechaCorteOriginal y Fecha90Original ahora se calculan directamente a partir de MAX(OrderDate), lo que simplifica los límites temporales de la extracción.</w:t>
+      </w:r>
+    </w:p>
+    <w:p>
+      <w:pPr>
+        <w:pStyle w:val="ListNumber"/>
+        <w:keepLines/>
+      </w:pPr>
+      <w:r>
+        <w:rPr>
+          <w:b/>
+        </w:rPr>
+        <w:t xml:space="preserve">Desempate de categoría favorita: </w:t>
+      </w:r>
+      <w:r>
+        <w:t>En FavoriteCategories, NEWID() se añadió como segundo criterio de ROW_NUMBER() después del conteo. Si varias categorías tienen la misma frecuencia máxima para un cliente, SQL Server elige una de forma aleatoria en lugar de aplicar un desempate alfabético fijo.</w:t>
+      </w:r>
+    </w:p>
+    <w:p>
+      <w:pPr>
+        <w:pStyle w:val="ListNumber"/>
+        <w:keepLines/>
+      </w:pPr>
+      <w:r>
+        <w:rPr>
+          <w:b/>
+        </w:rPr>
+        <w:t xml:space="preserve">Días entre órdenes consecutivas: </w:t>
+      </w:r>
+      <w:r>
+        <w:t>La CTE FechasOrdenes usa LAG(OrderDate) OVER (PARTITION BY CustomerID ORDER BY OrderDate) para obtener la fecha de la orden anterior del mismo cliente. DATEDIFF calcula el intervalo en días; luego se promedian esos intervalos para avg_days_between_orders.</w:t>
+      </w:r>
+    </w:p>
+    <w:p>
+      <w:pPr>
+        <w:pStyle w:val="ListNumber"/>
+        <w:keepLines/>
+      </w:pPr>
+      <w:r>
+        <w:rPr>
+          <w:b/>
+        </w:rPr>
+        <w:t xml:space="preserve">Cálculo de orders_per_month: </w:t>
+      </w:r>
+      <w:r>
+        <w:t>Se reemplazó el cálculo basado en DATEDIFF(MONTH) entre la primera y la última compra, que dependía de los límites de meses calendario. Ahora se divide el total de órdenes por los meses transcurridos desde la primera compra hasta FechaCorteOriginal, usando 30.4375 días por mes. Para clientes con menos de 30 días de antigüedad, se conserva total_orders como valor de frecuencia. Esta métrica queda separada del promedio de días entre órdenes.</w:t>
+      </w:r>
+    </w:p>
+    <w:p>
+      <w:pPr>
+        <w:pStyle w:val="ListNumber"/>
+        <w:keepLines/>
+      </w:pPr>
+      <w:r>
+        <w:rPr>
+          <w:b/>
+        </w:rPr>
+        <w:t xml:space="preserve">Promedio de valor por orden: </w:t>
+      </w:r>
+      <w:r>
+        <w:t>avg_order_value se calcula como total_spent / total_orders. total_spent suma los importes de las líneas de detalle y total_orders cuenta SalesOrderID distintos, así el resultado representa el gasto medio por pedido y no el promedio de una línea de producto.</w:t>
+      </w:r>
+    </w:p>
+    <w:p>
+      <w:r>
+        <w:t>Nota: el SQL se ejecutó correctamente y extrajo 19.820 clientes. La consulta también mantiene FechaHoy, DiasDesfase y FechaCorte en la CTE Fechas; el cambio documentado aquí se refiere a la eliminación de FechaHoyOriginal y a la nueva definición de los cortes originales.</w:t>
       </w:r>
     </w:p>
     <w:sectPr>

</xml_diff>